<commit_message>
Fix CV layout: tighter spacing, professional alignment, no wasted space
Reduced paragraph spacing, tightened line height, smaller photo box,
consistent font sizing across sections, compact bullet points.
Single page A4, clean and readable.

Co-Authored-By: Claude Opus 4.6 <noreply@anthropic.com>
Claude-Session: https://claude.ai/code/session_01J3MHbgot7owB5r5S7Rs5ec
</commit_message>
<xml_diff>
--- a/Gokul_Srinivasan_CV_Visual.docx
+++ b/Gokul_Srinivasan_CV_Visual.docx
@@ -22,7 +22,7 @@
       <w:tr>
         <w:tc>
           <w:tcPr>
-            <w:tcW w:type="dxa" w:w="3356"/>
+            <w:tcW w:type="dxa" w:w="3468"/>
             <w:tcBorders>
               <w:top w:val="none" w:color="FFFFFF" w:sz="0"/>
               <w:left w:val="none" w:color="FFFFFF" w:sz="0"/>
@@ -31,21 +31,22 @@
             </w:tcBorders>
             <w:shd w:fill="1B2A41" w:val="clear"/>
             <w:tcMar>
-              <w:top w:type="dxa" w:w="120"/>
-              <w:left w:type="dxa" w:w="220"/>
-              <w:bottom w:type="dxa" w:w="120"/>
-              <w:right w:type="dxa" w:w="180"/>
+              <w:top w:type="dxa" w:w="80"/>
+              <w:left w:type="dxa" w:w="200"/>
+              <w:bottom w:type="dxa" w:w="80"/>
+              <w:right w:type="dxa" w:w="160"/>
             </w:tcMar>
             <w:vAlign w:val="top"/>
           </w:tcPr>
           <w:p>
             <w:pPr>
-              <w:spacing w:after="0" w:before="40"/>
+              <w:spacing w:after="0" w:before="20" w:line="240"/>
+              <w:jc w:val="left"/>
             </w:pPr>
           </w:p>
           <w:tbl>
             <w:tblPr>
-              <w:tblW w:type="dxa" w:w="2856"/>
+              <w:tblW w:type="dxa" w:w="2968"/>
               <w:tblBorders>
                 <w:top w:val="single" w:color="auto" w:sz="4"/>
                 <w:left w:val="single" w:color="auto" w:sz="4"/>
@@ -61,11 +62,11 @@
             </w:tblGrid>
             <w:tr>
               <w:trPr>
-                <w:trHeight w:val="1700" w:hRule="exact"/>
+                <w:trHeight w:val="1400" w:hRule="exact"/>
               </w:trPr>
               <w:tc>
                 <w:tcPr>
-                  <w:tcW w:type="dxa" w:w="2856"/>
+                  <w:tcW w:type="dxa" w:w="2968"/>
                   <w:tcBorders>
                     <w:top w:val="dashed" w:color="AEC2DA" w:sz="1"/>
                     <w:left w:val="dashed" w:color="AEC2DA" w:sz="1"/>
@@ -77,6 +78,7 @@
                 </w:tcPr>
                 <w:p>
                   <w:pPr>
+                    <w:spacing w:after="0" w:before="0"/>
                     <w:jc w:val="center"/>
                   </w:pPr>
                   <w:r>
@@ -84,15 +86,18 @@
                       <w:rFonts w:ascii="Arial" w:cs="Arial" w:eastAsia="Arial" w:hAnsi="Arial"/>
                       <w:b/>
                       <w:bCs/>
+                      <w:i w:val="false"/>
+                      <w:iCs w:val="false"/>
                       <w:color w:val="AEC2DA"/>
-                      <w:sz w:val="20"/>
-                      <w:szCs w:val="20"/>
+                      <w:sz w:val="18"/>
+                      <w:szCs w:val="18"/>
                     </w:rPr>
                     <w:t xml:space="preserve">ADD</w:t>
                   </w:r>
                 </w:p>
                 <w:p>
                   <w:pPr>
+                    <w:spacing w:after="0" w:before="0"/>
                     <w:jc w:val="center"/>
                   </w:pPr>
                   <w:r>
@@ -100,9 +105,11 @@
                       <w:rFonts w:ascii="Arial" w:cs="Arial" w:eastAsia="Arial" w:hAnsi="Arial"/>
                       <w:b/>
                       <w:bCs/>
+                      <w:i w:val="false"/>
+                      <w:iCs w:val="false"/>
                       <w:color w:val="AEC2DA"/>
-                      <w:sz w:val="20"/>
-                      <w:szCs w:val="20"/>
+                      <w:sz w:val="18"/>
+                      <w:szCs w:val="18"/>
                     </w:rPr>
                     <w:t xml:space="preserve">PHOTO</w:t>
                   </w:r>
@@ -112,7 +119,7 @@
           </w:tbl>
           <w:p>
             <w:pPr>
-              <w:spacing w:after="20" w:before="180"/>
+              <w:spacing w:after="0" w:before="120" w:line="240"/>
               <w:jc w:val="left"/>
             </w:pPr>
             <w:r>
@@ -123,15 +130,15 @@
                 <w:i w:val="false"/>
                 <w:iCs w:val="false"/>
                 <w:color w:val="FFFFFF"/>
-                <w:sz w:val="30"/>
-                <w:szCs w:val="30"/>
+                <w:sz w:val="28"/>
+                <w:szCs w:val="28"/>
               </w:rPr>
               <w:t xml:space="preserve">GOKUL</w:t>
             </w:r>
           </w:p>
           <w:p>
             <w:pPr>
-              <w:spacing w:after="30" w:before="20"/>
+              <w:spacing w:after="10" w:before="0" w:line="240"/>
               <w:jc w:val="left"/>
             </w:pPr>
             <w:r>
@@ -142,15 +149,15 @@
                 <w:i w:val="false"/>
                 <w:iCs w:val="false"/>
                 <w:color w:val="FFFFFF"/>
-                <w:sz w:val="30"/>
-                <w:szCs w:val="30"/>
+                <w:sz w:val="28"/>
+                <w:szCs w:val="28"/>
               </w:rPr>
               <w:t xml:space="preserve">SRINIVASAN</w:t>
             </w:r>
           </w:p>
           <w:p>
             <w:pPr>
-              <w:spacing w:after="20" w:before="20"/>
+              <w:spacing w:after="20" w:before="0" w:line="240"/>
               <w:jc w:val="left"/>
             </w:pPr>
             <w:r>
@@ -161,66 +168,47 @@
                 <w:i w:val="false"/>
                 <w:iCs w:val="false"/>
                 <w:color w:val="5FA8FF"/>
-                <w:sz w:val="16"/>
-                <w:szCs w:val="16"/>
-              </w:rPr>
-              <w:t xml:space="preserve">PRODUCT MANAGER</w:t>
-            </w:r>
-          </w:p>
-          <w:p>
-            <w:pPr>
-              <w:spacing w:after="40" w:before="20"/>
-              <w:jc w:val="left"/>
-            </w:pPr>
-            <w:r>
-              <w:rPr>
-                <w:rFonts w:ascii="Arial" w:cs="Arial" w:eastAsia="Arial" w:hAnsi="Arial"/>
-                <w:b/>
-                <w:bCs/>
-                <w:i w:val="false"/>
-                <w:iCs w:val="false"/>
-                <w:color w:val="5FA8FF"/>
-                <w:sz w:val="16"/>
-                <w:szCs w:val="16"/>
-              </w:rPr>
-              <w:t xml:space="preserve">GROWTH · OPS</w:t>
-            </w:r>
-          </w:p>
-          <w:p>
-            <w:pPr>
-              <w:spacing w:after="20" w:before="20"/>
-              <w:jc w:val="left"/>
-            </w:pPr>
-            <w:r>
-              <w:rPr>
-                <w:rFonts w:ascii="Arial" w:cs="Arial" w:eastAsia="Arial" w:hAnsi="Arial"/>
-                <w:b/>
-                <w:bCs/>
-                <w:i w:val="false"/>
-                <w:iCs w:val="false"/>
-                <w:color w:val="7FE0A8"/>
                 <w:sz w:val="15"/>
                 <w:szCs w:val="15"/>
               </w:rPr>
-              <w:t xml:space="preserve">✓ </w:t>
-            </w:r>
-            <w:r>
-              <w:rPr>
-                <w:rFonts w:ascii="Arial" w:cs="Arial" w:eastAsia="Arial" w:hAnsi="Arial"/>
-                <w:b w:val="false"/>
-                <w:bCs w:val="false"/>
+              <w:t xml:space="preserve">PRODUCT MANAGER · GROWTH · OPS</w:t>
+            </w:r>
+          </w:p>
+          <w:p>
+            <w:pPr>
+              <w:spacing w:after="0" w:before="0" w:line="240"/>
+              <w:jc w:val="left"/>
+            </w:pPr>
+            <w:r>
+              <w:rPr>
+                <w:rFonts w:ascii="Arial" w:cs="Arial" w:eastAsia="Arial" w:hAnsi="Arial"/>
+                <w:b/>
+                <w:bCs/>
                 <w:i w:val="false"/>
                 <w:iCs w:val="false"/>
                 <w:color w:val="7FE0A8"/>
                 <w:sz w:val="14"/>
                 <w:szCs w:val="14"/>
               </w:rPr>
+              <w:t xml:space="preserve">✓ </w:t>
+            </w:r>
+            <w:r>
+              <w:rPr>
+                <w:rFonts w:ascii="Arial" w:cs="Arial" w:eastAsia="Arial" w:hAnsi="Arial"/>
+                <w:b w:val="false"/>
+                <w:bCs w:val="false"/>
+                <w:i w:val="false"/>
+                <w:iCs w:val="false"/>
+                <w:color w:val="7FE0A8"/>
+                <w:sz w:val="13"/>
+                <w:szCs w:val="13"/>
+              </w:rPr>
               <w:t xml:space="preserve">Authorized to work in France</w:t>
             </w:r>
           </w:p>
           <w:p>
             <w:pPr>
-              <w:spacing w:after="40" w:before="20"/>
+              <w:spacing w:after="20" w:before="0" w:line="240"/>
               <w:jc w:val="left"/>
             </w:pPr>
             <w:r>
@@ -231,8 +219,8 @@
                 <w:i w:val="false"/>
                 <w:iCs w:val="false"/>
                 <w:color w:val="7FE0A8"/>
-                <w:sz w:val="14"/>
-                <w:szCs w:val="14"/>
+                <w:sz w:val="13"/>
+                <w:szCs w:val="13"/>
               </w:rPr>
               <w:t xml:space="preserve">   No sponsorship needed</w:t>
             </w:r>
@@ -242,24 +230,26 @@
               <w:pBdr>
                 <w:bottom w:val="single" w:color="3A5A80" w:sz="1"/>
               </w:pBdr>
-              <w:spacing w:after="80" w:before="200"/>
-            </w:pPr>
-            <w:r>
-              <w:rPr>
-                <w:rFonts w:ascii="Arial" w:cs="Arial" w:eastAsia="Arial" w:hAnsi="Arial"/>
-                <w:b/>
-                <w:bCs/>
-                <w:caps/>
+              <w:spacing w:after="50" w:before="140" w:line="240"/>
+              <w:jc w:val="left"/>
+            </w:pPr>
+            <w:r>
+              <w:rPr>
+                <w:rFonts w:ascii="Arial" w:cs="Arial" w:eastAsia="Arial" w:hAnsi="Arial"/>
+                <w:b/>
+                <w:bCs/>
+                <w:i w:val="false"/>
+                <w:iCs w:val="false"/>
                 <w:color w:val="5FA8FF"/>
-                <w:sz w:val="19"/>
-                <w:szCs w:val="19"/>
+                <w:sz w:val="18"/>
+                <w:szCs w:val="18"/>
               </w:rPr>
               <w:t xml:space="preserve">CONTACT</w:t>
             </w:r>
           </w:p>
           <w:p>
             <w:pPr>
-              <w:spacing w:after="20" w:before="20"/>
+              <w:spacing w:after="5" w:before="10" w:line="240"/>
               <w:jc w:val="left"/>
             </w:pPr>
             <w:r>
@@ -270,15 +260,15 @@
                 <w:i w:val="false"/>
                 <w:iCs w:val="false"/>
                 <w:color w:val="E7EDF5"/>
-                <w:sz w:val="17"/>
-                <w:szCs w:val="17"/>
+                <w:sz w:val="16"/>
+                <w:szCs w:val="16"/>
               </w:rPr>
               <w:t xml:space="preserve">Paris, France</w:t>
             </w:r>
           </w:p>
           <w:p>
             <w:pPr>
-              <w:spacing w:after="20" w:before="20"/>
+              <w:spacing w:after="5" w:before="5" w:line="240"/>
               <w:jc w:val="left"/>
             </w:pPr>
             <w:r>
@@ -289,15 +279,15 @@
                 <w:i w:val="false"/>
                 <w:iCs w:val="false"/>
                 <w:color w:val="E7EDF5"/>
-                <w:sz w:val="17"/>
-                <w:szCs w:val="17"/>
+                <w:sz w:val="16"/>
+                <w:szCs w:val="16"/>
               </w:rPr>
               <w:t xml:space="preserve">+33 7 45 43 23 95</w:t>
             </w:r>
           </w:p>
           <w:p>
             <w:pPr>
-              <w:spacing w:after="20" w:before="20"/>
+              <w:spacing w:after="5" w:before="5" w:line="240"/>
               <w:jc w:val="left"/>
             </w:pPr>
             <w:r>
@@ -308,23 +298,24 @@
                 <w:i w:val="false"/>
                 <w:iCs w:val="false"/>
                 <w:color w:val="E7EDF5"/>
-                <w:sz w:val="16"/>
-                <w:szCs w:val="16"/>
+                <w:sz w:val="15"/>
+                <w:szCs w:val="15"/>
               </w:rPr>
               <w:t xml:space="preserve">gokul26222@gmail.com</w:t>
             </w:r>
           </w:p>
           <w:p>
             <w:pPr>
-              <w:spacing w:after="20" w:before="20"/>
-            </w:pPr>
-            <w:hyperlink w:history="1" r:id="rIdeuc0cojy4g0yypuu6f2ff">
+              <w:spacing w:after="5" w:before="5" w:line="240"/>
+              <w:jc w:val="left"/>
+            </w:pPr>
+            <w:hyperlink w:history="1" r:id="rIdrlmncvesfxsh0ylefmj1o">
               <w:r>
                 <w:rPr>
                   <w:rFonts w:ascii="Arial" w:cs="Arial" w:eastAsia="Arial" w:hAnsi="Arial"/>
                   <w:color w:val="5FA8FF"/>
-                  <w:sz w:val="16"/>
-                  <w:szCs w:val="16"/>
+                  <w:sz w:val="15"/>
+                  <w:szCs w:val="15"/>
                   <w:u w:val="single"/>
                 </w:rPr>
                 <w:t xml:space="preserve">linkedin.com/in/gokulsrini</w:t>
@@ -333,15 +324,16 @@
           </w:p>
           <w:p>
             <w:pPr>
-              <w:spacing w:after="20" w:before="20"/>
-            </w:pPr>
-            <w:hyperlink w:history="1" r:id="rIdzbi5s3uf8o3imcdr3kzrs">
+              <w:spacing w:after="5" w:before="5" w:line="240"/>
+              <w:jc w:val="left"/>
+            </w:pPr>
+            <w:hyperlink w:history="1" r:id="rId5o_xvztcypk1kmzy1qtuo">
               <w:r>
                 <w:rPr>
                   <w:rFonts w:ascii="Arial" w:cs="Arial" w:eastAsia="Arial" w:hAnsi="Arial"/>
                   <w:color w:val="5FA8FF"/>
-                  <w:sz w:val="16"/>
-                  <w:szCs w:val="16"/>
+                  <w:sz w:val="15"/>
+                  <w:szCs w:val="15"/>
                   <w:u w:val="single"/>
                 </w:rPr>
                 <w:t xml:space="preserve">Portfolio ↗</w:t>
@@ -353,24 +345,26 @@
               <w:pBdr>
                 <w:bottom w:val="single" w:color="3A5A80" w:sz="1"/>
               </w:pBdr>
-              <w:spacing w:after="80" w:before="200"/>
-            </w:pPr>
-            <w:r>
-              <w:rPr>
-                <w:rFonts w:ascii="Arial" w:cs="Arial" w:eastAsia="Arial" w:hAnsi="Arial"/>
-                <w:b/>
-                <w:bCs/>
-                <w:caps/>
+              <w:spacing w:after="50" w:before="140" w:line="240"/>
+              <w:jc w:val="left"/>
+            </w:pPr>
+            <w:r>
+              <w:rPr>
+                <w:rFonts w:ascii="Arial" w:cs="Arial" w:eastAsia="Arial" w:hAnsi="Arial"/>
+                <w:b/>
+                <w:bCs/>
+                <w:i w:val="false"/>
+                <w:iCs w:val="false"/>
                 <w:color w:val="5FA8FF"/>
-                <w:sz w:val="19"/>
-                <w:szCs w:val="19"/>
+                <w:sz w:val="18"/>
+                <w:szCs w:val="18"/>
               </w:rPr>
               <w:t xml:space="preserve">LANGUAGES</w:t>
             </w:r>
           </w:p>
           <w:p>
             <w:pPr>
-              <w:spacing w:after="20" w:before="20"/>
+              <w:spacing w:after="5" w:before="10" w:line="240"/>
               <w:jc w:val="left"/>
             </w:pPr>
             <w:r>
@@ -381,8 +375,8 @@
                 <w:i w:val="false"/>
                 <w:iCs w:val="false"/>
                 <w:color w:val="E7EDF5"/>
-                <w:sz w:val="17"/>
-                <w:szCs w:val="17"/>
+                <w:sz w:val="16"/>
+                <w:szCs w:val="16"/>
               </w:rPr>
               <w:t xml:space="preserve">English</w:t>
             </w:r>
@@ -394,15 +388,15 @@
                 <w:i w:val="false"/>
                 <w:iCs w:val="false"/>
                 <w:color w:val="AEC2DA"/>
-                <w:sz w:val="15"/>
-                <w:szCs w:val="15"/>
+                <w:sz w:val="14"/>
+                <w:szCs w:val="14"/>
               </w:rPr>
               <w:t xml:space="preserve"> — Fluent (C2)</w:t>
             </w:r>
           </w:p>
           <w:p>
             <w:pPr>
-              <w:spacing w:after="20" w:before="20"/>
+              <w:spacing w:after="5" w:before="5" w:line="240"/>
               <w:jc w:val="left"/>
             </w:pPr>
             <w:r>
@@ -413,8 +407,8 @@
                 <w:i w:val="false"/>
                 <w:iCs w:val="false"/>
                 <w:color w:val="E7EDF5"/>
-                <w:sz w:val="17"/>
-                <w:szCs w:val="17"/>
+                <w:sz w:val="16"/>
+                <w:szCs w:val="16"/>
               </w:rPr>
               <w:t xml:space="preserve">Tamil</w:t>
             </w:r>
@@ -426,15 +420,15 @@
                 <w:i w:val="false"/>
                 <w:iCs w:val="false"/>
                 <w:color w:val="AEC2DA"/>
-                <w:sz w:val="15"/>
-                <w:szCs w:val="15"/>
+                <w:sz w:val="14"/>
+                <w:szCs w:val="14"/>
               </w:rPr>
               <w:t xml:space="preserve"> — Native</w:t>
             </w:r>
           </w:p>
           <w:p>
             <w:pPr>
-              <w:spacing w:after="20" w:before="20"/>
+              <w:spacing w:after="5" w:before="5" w:line="240"/>
               <w:jc w:val="left"/>
             </w:pPr>
             <w:r>
@@ -445,8 +439,8 @@
                 <w:i w:val="false"/>
                 <w:iCs w:val="false"/>
                 <w:color w:val="E7EDF5"/>
-                <w:sz w:val="17"/>
-                <w:szCs w:val="17"/>
+                <w:sz w:val="16"/>
+                <w:szCs w:val="16"/>
               </w:rPr>
               <w:t xml:space="preserve">French</w:t>
             </w:r>
@@ -458,8 +452,8 @@
                 <w:i w:val="false"/>
                 <w:iCs w:val="false"/>
                 <w:color w:val="AEC2DA"/>
-                <w:sz w:val="15"/>
-                <w:szCs w:val="15"/>
+                <w:sz w:val="14"/>
+                <w:szCs w:val="14"/>
               </w:rPr>
               <w:t xml:space="preserve"> — A2, in training</w:t>
             </w:r>
@@ -469,24 +463,26 @@
               <w:pBdr>
                 <w:bottom w:val="single" w:color="3A5A80" w:sz="1"/>
               </w:pBdr>
-              <w:spacing w:after="80" w:before="200"/>
-            </w:pPr>
-            <w:r>
-              <w:rPr>
-                <w:rFonts w:ascii="Arial" w:cs="Arial" w:eastAsia="Arial" w:hAnsi="Arial"/>
-                <w:b/>
-                <w:bCs/>
-                <w:caps/>
+              <w:spacing w:after="50" w:before="140" w:line="240"/>
+              <w:jc w:val="left"/>
+            </w:pPr>
+            <w:r>
+              <w:rPr>
+                <w:rFonts w:ascii="Arial" w:cs="Arial" w:eastAsia="Arial" w:hAnsi="Arial"/>
+                <w:b/>
+                <w:bCs/>
+                <w:i w:val="false"/>
+                <w:iCs w:val="false"/>
                 <w:color w:val="5FA8FF"/>
-                <w:sz w:val="19"/>
-                <w:szCs w:val="19"/>
+                <w:sz w:val="18"/>
+                <w:szCs w:val="18"/>
               </w:rPr>
               <w:t xml:space="preserve">EDUCATION</w:t>
             </w:r>
           </w:p>
           <w:p>
             <w:pPr>
-              <w:spacing w:after="20" w:before="20"/>
+              <w:spacing w:after="0" w:before="10" w:line="240"/>
               <w:jc w:val="left"/>
             </w:pPr>
             <w:r>
@@ -497,15 +493,15 @@
                 <w:i w:val="false"/>
                 <w:iCs w:val="false"/>
                 <w:color w:val="E7EDF5"/>
-                <w:sz w:val="17"/>
-                <w:szCs w:val="17"/>
+                <w:sz w:val="16"/>
+                <w:szCs w:val="16"/>
               </w:rPr>
               <w:t xml:space="preserve">MSc International Business</w:t>
             </w:r>
           </w:p>
           <w:p>
             <w:pPr>
-              <w:spacing w:after="20" w:before="20"/>
+              <w:spacing w:after="0" w:before="0" w:line="240"/>
               <w:jc w:val="left"/>
             </w:pPr>
             <w:r>
@@ -516,15 +512,15 @@
                 <w:i w:val="false"/>
                 <w:iCs w:val="false"/>
                 <w:color w:val="AEC2DA"/>
-                <w:sz w:val="15"/>
-                <w:szCs w:val="15"/>
+                <w:sz w:val="14"/>
+                <w:szCs w:val="14"/>
               </w:rPr>
               <w:t xml:space="preserve">EMLV Grande École, Paris</w:t>
             </w:r>
           </w:p>
           <w:p>
             <w:pPr>
-              <w:spacing w:after="20" w:before="20"/>
+              <w:spacing w:after="5" w:before="0" w:line="240"/>
               <w:jc w:val="left"/>
             </w:pPr>
             <w:r>
@@ -535,8 +531,8 @@
                 <w:i w:val="false"/>
                 <w:iCs w:val="false"/>
                 <w:color w:val="AEC2DA"/>
-                <w:sz w:val="15"/>
-                <w:szCs w:val="15"/>
+                <w:sz w:val="14"/>
+                <w:szCs w:val="14"/>
               </w:rPr>
               <w:t xml:space="preserve">2023 – 2025</w:t>
             </w:r>
@@ -546,24 +542,26 @@
               <w:pBdr>
                 <w:bottom w:val="single" w:color="3A5A80" w:sz="1"/>
               </w:pBdr>
-              <w:spacing w:after="80" w:before="200"/>
-            </w:pPr>
-            <w:r>
-              <w:rPr>
-                <w:rFonts w:ascii="Arial" w:cs="Arial" w:eastAsia="Arial" w:hAnsi="Arial"/>
-                <w:b/>
-                <w:bCs/>
-                <w:caps/>
+              <w:spacing w:after="50" w:before="140" w:line="240"/>
+              <w:jc w:val="left"/>
+            </w:pPr>
+            <w:r>
+              <w:rPr>
+                <w:rFonts w:ascii="Arial" w:cs="Arial" w:eastAsia="Arial" w:hAnsi="Arial"/>
+                <w:b/>
+                <w:bCs/>
+                <w:i w:val="false"/>
+                <w:iCs w:val="false"/>
                 <w:color w:val="5FA8FF"/>
-                <w:sz w:val="19"/>
-                <w:szCs w:val="19"/>
+                <w:sz w:val="18"/>
+                <w:szCs w:val="18"/>
               </w:rPr>
               <w:t xml:space="preserve">CERTIFICATIONS</w:t>
             </w:r>
           </w:p>
           <w:p>
             <w:pPr>
-              <w:spacing w:after="20" w:before="20"/>
+              <w:spacing w:after="0" w:before="10" w:line="240"/>
               <w:jc w:val="left"/>
             </w:pPr>
             <w:r>
@@ -574,15 +572,15 @@
                 <w:i w:val="false"/>
                 <w:iCs w:val="false"/>
                 <w:color w:val="E7EDF5"/>
-                <w:sz w:val="16"/>
-                <w:szCs w:val="16"/>
+                <w:sz w:val="15"/>
+                <w:szCs w:val="15"/>
               </w:rPr>
               <w:t xml:space="preserve">Product Prioritization</w:t>
             </w:r>
           </w:p>
           <w:p>
             <w:pPr>
-              <w:spacing w:after="20" w:before="20"/>
+              <w:spacing w:after="10" w:before="0" w:line="240"/>
               <w:jc w:val="left"/>
             </w:pPr>
             <w:r>
@@ -593,15 +591,15 @@
                 <w:i w:val="false"/>
                 <w:iCs w:val="false"/>
                 <w:color w:val="AEC2DA"/>
-                <w:sz w:val="14"/>
-                <w:szCs w:val="14"/>
+                <w:sz w:val="13"/>
+                <w:szCs w:val="13"/>
               </w:rPr>
               <w:t xml:space="preserve">Product School</w:t>
             </w:r>
           </w:p>
           <w:p>
             <w:pPr>
-              <w:spacing w:after="20" w:before="50"/>
+              <w:spacing w:after="0" w:before="10" w:line="240"/>
               <w:jc w:val="left"/>
             </w:pPr>
             <w:r>
@@ -612,15 +610,15 @@
                 <w:i w:val="false"/>
                 <w:iCs w:val="false"/>
                 <w:color w:val="E7EDF5"/>
-                <w:sz w:val="16"/>
-                <w:szCs w:val="16"/>
+                <w:sz w:val="15"/>
+                <w:szCs w:val="15"/>
               </w:rPr>
               <w:t xml:space="preserve">Agile Project Mgmt</w:t>
             </w:r>
           </w:p>
           <w:p>
             <w:pPr>
-              <w:spacing w:after="20" w:before="20"/>
+              <w:spacing w:after="10" w:before="0" w:line="240"/>
               <w:jc w:val="left"/>
             </w:pPr>
             <w:r>
@@ -631,15 +629,15 @@
                 <w:i w:val="false"/>
                 <w:iCs w:val="false"/>
                 <w:color w:val="AEC2DA"/>
-                <w:sz w:val="14"/>
-                <w:szCs w:val="14"/>
+                <w:sz w:val="13"/>
+                <w:szCs w:val="13"/>
               </w:rPr>
               <w:t xml:space="preserve">PMI France</w:t>
             </w:r>
           </w:p>
           <w:p>
             <w:pPr>
-              <w:spacing w:after="20" w:before="50"/>
+              <w:spacing w:after="0" w:before="10" w:line="240"/>
               <w:jc w:val="left"/>
             </w:pPr>
             <w:r>
@@ -650,8 +648,8 @@
                 <w:i w:val="false"/>
                 <w:iCs w:val="false"/>
                 <w:color w:val="E7EDF5"/>
-                <w:sz w:val="16"/>
-                <w:szCs w:val="16"/>
+                <w:sz w:val="15"/>
+                <w:szCs w:val="15"/>
               </w:rPr>
               <w:t xml:space="preserve">HubSpot Inbound &amp; Sales</w:t>
             </w:r>
@@ -661,24 +659,26 @@
               <w:pBdr>
                 <w:bottom w:val="single" w:color="3A5A80" w:sz="1"/>
               </w:pBdr>
-              <w:spacing w:after="80" w:before="200"/>
-            </w:pPr>
-            <w:r>
-              <w:rPr>
-                <w:rFonts w:ascii="Arial" w:cs="Arial" w:eastAsia="Arial" w:hAnsi="Arial"/>
-                <w:b/>
-                <w:bCs/>
-                <w:caps/>
+              <w:spacing w:after="50" w:before="140" w:line="240"/>
+              <w:jc w:val="left"/>
+            </w:pPr>
+            <w:r>
+              <w:rPr>
+                <w:rFonts w:ascii="Arial" w:cs="Arial" w:eastAsia="Arial" w:hAnsi="Arial"/>
+                <w:b/>
+                <w:bCs/>
+                <w:i w:val="false"/>
+                <w:iCs w:val="false"/>
                 <w:color w:val="5FA8FF"/>
-                <w:sz w:val="19"/>
-                <w:szCs w:val="19"/>
+                <w:sz w:val="18"/>
+                <w:szCs w:val="18"/>
               </w:rPr>
               <w:t xml:space="preserve">CORE TOOLS</w:t>
             </w:r>
           </w:p>
           <w:p>
             <w:pPr>
-              <w:spacing w:after="20" w:before="20"/>
+              <w:spacing w:after="5" w:before="10" w:line="240"/>
               <w:jc w:val="left"/>
             </w:pPr>
             <w:r>
@@ -689,15 +689,15 @@
                 <w:i w:val="false"/>
                 <w:iCs w:val="false"/>
                 <w:color w:val="E7EDF5"/>
-                <w:sz w:val="17"/>
-                <w:szCs w:val="17"/>
+                <w:sz w:val="15"/>
+                <w:szCs w:val="15"/>
               </w:rPr>
               <w:t xml:space="preserve">Notion · Jira · Figma</w:t>
             </w:r>
           </w:p>
           <w:p>
             <w:pPr>
-              <w:spacing w:after="20" w:before="20"/>
+              <w:spacing w:after="5" w:before="5" w:line="240"/>
               <w:jc w:val="left"/>
             </w:pPr>
             <w:r>
@@ -708,15 +708,15 @@
                 <w:i w:val="false"/>
                 <w:iCs w:val="false"/>
                 <w:color w:val="E7EDF5"/>
-                <w:sz w:val="17"/>
-                <w:szCs w:val="17"/>
+                <w:sz w:val="15"/>
+                <w:szCs w:val="15"/>
               </w:rPr>
               <w:t xml:space="preserve">Mixpanel · Amplitude</w:t>
             </w:r>
           </w:p>
           <w:p>
             <w:pPr>
-              <w:spacing w:after="20" w:before="20"/>
+              <w:spacing w:after="5" w:before="5" w:line="240"/>
               <w:jc w:val="left"/>
             </w:pPr>
             <w:r>
@@ -727,8 +727,8 @@
                 <w:i w:val="false"/>
                 <w:iCs w:val="false"/>
                 <w:color w:val="E7EDF5"/>
-                <w:sz w:val="17"/>
-                <w:szCs w:val="17"/>
+                <w:sz w:val="15"/>
+                <w:szCs w:val="15"/>
               </w:rPr>
               <w:t xml:space="preserve">Google Analytics · Hotjar</w:t>
             </w:r>
@@ -736,7 +736,7 @@
         </w:tc>
         <w:tc>
           <w:tcPr>
-            <w:tcW w:type="dxa" w:w="7830"/>
+            <w:tcW w:type="dxa" w:w="7718"/>
             <w:tcBorders>
               <w:top w:val="none" w:color="FFFFFF" w:sz="0"/>
               <w:left w:val="none" w:color="FFFFFF" w:sz="0"/>
@@ -745,10 +745,10 @@
             </w:tcBorders>
             <w:shd w:fill="FFFFFF" w:val="clear"/>
             <w:tcMar>
-              <w:top w:type="dxa" w:w="120"/>
-              <w:left w:type="dxa" w:w="240"/>
-              <w:bottom w:type="dxa" w:w="120"/>
-              <w:right w:type="dxa" w:w="180"/>
+              <w:top w:type="dxa" w:w="80"/>
+              <w:left w:type="dxa" w:w="220"/>
+              <w:bottom w:type="dxa" w:w="80"/>
+              <w:right w:type="dxa" w:w="140"/>
             </w:tcMar>
             <w:vAlign w:val="top"/>
           </w:tcPr>
@@ -757,36 +757,38 @@
               <w:pBdr>
                 <w:bottom w:val="single" w:color="1B4FD8" w:sz="1"/>
               </w:pBdr>
-              <w:spacing w:after="80" w:before="200"/>
-            </w:pPr>
-            <w:r>
-              <w:rPr>
-                <w:rFonts w:ascii="Arial" w:cs="Arial" w:eastAsia="Arial" w:hAnsi="Arial"/>
-                <w:b/>
-                <w:bCs/>
-                <w:caps/>
+              <w:spacing w:after="40" w:before="120" w:line="240"/>
+              <w:jc w:val="left"/>
+            </w:pPr>
+            <w:r>
+              <w:rPr>
+                <w:rFonts w:ascii="Arial" w:cs="Arial" w:eastAsia="Arial" w:hAnsi="Arial"/>
+                <w:b/>
+                <w:bCs/>
+                <w:i w:val="false"/>
+                <w:iCs w:val="false"/>
                 <w:color w:val="1B4FD8"/>
-                <w:sz w:val="21"/>
-                <w:szCs w:val="21"/>
+                <w:sz w:val="19"/>
+                <w:szCs w:val="19"/>
               </w:rPr>
               <w:t xml:space="preserve">PROFILE</w:t>
             </w:r>
           </w:p>
           <w:p>
             <w:pPr>
-              <w:spacing w:after="80" w:before="40"/>
-              <w:jc w:val="left"/>
-            </w:pPr>
-            <w:r>
-              <w:rPr>
-                <w:rFonts w:ascii="Arial" w:cs="Arial" w:eastAsia="Arial" w:hAnsi="Arial"/>
-                <w:b w:val="false"/>
-                <w:bCs w:val="false"/>
-                <w:i w:val="false"/>
-                <w:iCs w:val="false"/>
-                <w:color w:val="26303D"/>
-                <w:sz w:val="17"/>
-                <w:szCs w:val="17"/>
+              <w:spacing w:after="40" w:before="20" w:line="230"/>
+              <w:jc w:val="left"/>
+            </w:pPr>
+            <w:r>
+              <w:rPr>
+                <w:rFonts w:ascii="Arial" w:cs="Arial" w:eastAsia="Arial" w:hAnsi="Arial"/>
+                <w:b w:val="false"/>
+                <w:bCs w:val="false"/>
+                <w:i w:val="false"/>
+                <w:iCs w:val="false"/>
+                <w:color w:val="26303D"/>
+                <w:sz w:val="16"/>
+                <w:szCs w:val="16"/>
               </w:rPr>
               <w:t xml:space="preserve">Product-minded business graduate with 3+ years across customer success, support engineering and sales. Building case studies and shipping real prototypes (Cleo, PlayPal) to prove product thinking through execution. MSc International Business, EMLV Paris. Based in Paris, fully authorized to work in France.</w:t>
             </w:r>
@@ -796,37 +798,39 @@
               <w:pBdr>
                 <w:bottom w:val="single" w:color="1B4FD8" w:sz="1"/>
               </w:pBdr>
-              <w:spacing w:after="80" w:before="200"/>
-            </w:pPr>
-            <w:r>
-              <w:rPr>
-                <w:rFonts w:ascii="Arial" w:cs="Arial" w:eastAsia="Arial" w:hAnsi="Arial"/>
-                <w:b/>
-                <w:bCs/>
-                <w:caps/>
+              <w:spacing w:after="40" w:before="120" w:line="240"/>
+              <w:jc w:val="left"/>
+            </w:pPr>
+            <w:r>
+              <w:rPr>
+                <w:rFonts w:ascii="Arial" w:cs="Arial" w:eastAsia="Arial" w:hAnsi="Arial"/>
+                <w:b/>
+                <w:bCs/>
+                <w:i w:val="false"/>
+                <w:iCs w:val="false"/>
                 <w:color w:val="1B4FD8"/>
-                <w:sz w:val="21"/>
-                <w:szCs w:val="21"/>
-              </w:rPr>
-              <w:t xml:space="preserve">PROJECTS</w:t>
-            </w:r>
-          </w:p>
-          <w:p>
-            <w:pPr>
-              <w:spacing w:after="20" w:before="60"/>
-              <w:jc w:val="left"/>
-            </w:pPr>
-            <w:r>
-              <w:rPr>
-                <w:rFonts w:ascii="Arial" w:cs="Arial" w:eastAsia="Arial" w:hAnsi="Arial"/>
-                <w:b/>
-                <w:bCs/>
-                <w:i w:val="false"/>
-                <w:iCs w:val="false"/>
-                <w:color w:val="26303D"/>
                 <w:sz w:val="19"/>
                 <w:szCs w:val="19"/>
               </w:rPr>
+              <w:t xml:space="preserve">PROJECTS</w:t>
+            </w:r>
+          </w:p>
+          <w:p>
+            <w:pPr>
+              <w:spacing w:after="0" w:before="30" w:line="240"/>
+              <w:jc w:val="left"/>
+            </w:pPr>
+            <w:r>
+              <w:rPr>
+                <w:rFonts w:ascii="Arial" w:cs="Arial" w:eastAsia="Arial" w:hAnsi="Arial"/>
+                <w:b/>
+                <w:bCs/>
+                <w:i w:val="false"/>
+                <w:iCs w:val="false"/>
+                <w:color w:val="26303D"/>
+                <w:sz w:val="18"/>
+                <w:szCs w:val="18"/>
+              </w:rPr>
               <w:t xml:space="preserve">Cleo</w:t>
             </w:r>
             <w:r>
@@ -848,8 +852,8 @@
                 <w:b/>
                 <w:bCs/>
                 <w:color w:val="FFFFFF"/>
-                <w:sz w:val="14"/>
-                <w:szCs w:val="14"/>
+                <w:sz w:val="13"/>
+                <w:szCs w:val="13"/>
                 <w:shd w:fill="1B4FD8" w:color="1B4FD8" w:val="clear"/>
               </w:rPr>
               <w:t xml:space="preserve"> LIVE </w:t>
@@ -857,7 +861,7 @@
           </w:p>
           <w:p>
             <w:pPr>
-              <w:spacing w:after="20" w:before="20"/>
+              <w:spacing w:after="0" w:before="0" w:line="240"/>
               <w:jc w:val="left"/>
             </w:pPr>
             <w:r>
@@ -868,23 +872,24 @@
                 <w:i/>
                 <w:iCs/>
                 <w:color w:val="55606E"/>
-                <w:sz w:val="15"/>
-                <w:szCs w:val="15"/>
+                <w:sz w:val="14"/>
+                <w:szCs w:val="14"/>
               </w:rPr>
               <w:t xml:space="preserve">Next.js · Gemini · Groq/Llama</w:t>
             </w:r>
           </w:p>
           <w:p>
             <w:pPr>
-              <w:spacing w:after="30" w:before="0"/>
-            </w:pPr>
-            <w:hyperlink w:history="1" r:id="rIdol9axjwsz08i__0j4xeth">
+              <w:spacing w:after="10" w:before="0" w:line="240"/>
+              <w:jc w:val="left"/>
+            </w:pPr>
+            <w:hyperlink w:history="1" r:id="rIdzn3nf5aldnd7p2e1_zaqm">
               <w:r>
                 <w:rPr>
                   <w:rFonts w:ascii="Arial" w:cs="Arial" w:eastAsia="Arial" w:hAnsi="Arial"/>
                   <w:color w:val="1B4FD8"/>
-                  <w:sz w:val="16"/>
-                  <w:szCs w:val="16"/>
+                  <w:sz w:val="14"/>
+                  <w:szCs w:val="14"/>
                   <w:u w:val="single"/>
                 </w:rPr>
                 <w:t xml:space="preserve">cleo-app-theta.vercel.app</w:t>
@@ -893,21 +898,22 @@
           </w:p>
           <w:p>
             <w:pPr>
-              <w:spacing w:after="20" w:before="20"/>
-              <w:ind w:left="200" w:hanging="200"/>
-            </w:pPr>
-            <w:r>
-              <w:rPr>
-                <w:rFonts w:ascii="Arial" w:cs="Arial" w:eastAsia="Arial" w:hAnsi="Arial"/>
-                <w:b w:val="false"/>
-                <w:bCs w:val="false"/>
-                <w:i w:val="false"/>
-                <w:iCs w:val="false"/>
-                <w:color w:val="26303D"/>
-                <w:sz w:val="16"/>
-                <w:szCs w:val="16"/>
-              </w:rPr>
-              <w:t xml:space="preserve">•  </w:t>
+              <w:spacing w:after="10" w:before="10" w:line="230"/>
+              <w:ind w:left="160" w:hanging="160"/>
+              <w:jc w:val="left"/>
+            </w:pPr>
+            <w:r>
+              <w:rPr>
+                <w:rFonts w:ascii="Arial" w:cs="Arial" w:eastAsia="Arial" w:hAnsi="Arial"/>
+                <w:b w:val="false"/>
+                <w:bCs w:val="false"/>
+                <w:i w:val="false"/>
+                <w:iCs w:val="false"/>
+                <w:color w:val="26303D"/>
+                <w:sz w:val="16"/>
+                <w:szCs w:val="16"/>
+              </w:rPr>
+              <w:t xml:space="preserve">• </w:t>
             </w:r>
             <w:r>
               <w:rPr>
@@ -925,51 +931,52 @@
           </w:p>
           <w:p>
             <w:pPr>
-              <w:spacing w:after="20" w:before="20"/>
-              <w:ind w:left="200" w:hanging="200"/>
-            </w:pPr>
-            <w:r>
-              <w:rPr>
-                <w:rFonts w:ascii="Arial" w:cs="Arial" w:eastAsia="Arial" w:hAnsi="Arial"/>
-                <w:b w:val="false"/>
-                <w:bCs w:val="false"/>
-                <w:i w:val="false"/>
-                <w:iCs w:val="false"/>
-                <w:color w:val="26303D"/>
-                <w:sz w:val="16"/>
-                <w:szCs w:val="16"/>
-              </w:rPr>
-              <w:t xml:space="preserve">•  </w:t>
-            </w:r>
-            <w:r>
-              <w:rPr>
-                <w:rFonts w:ascii="Arial" w:cs="Arial" w:eastAsia="Arial" w:hAnsi="Arial"/>
-                <w:b w:val="false"/>
-                <w:bCs w:val="false"/>
-                <w:i w:val="false"/>
-                <w:iCs w:val="false"/>
-                <w:color w:val="26303D"/>
-                <w:sz w:val="16"/>
-                <w:szCs w:val="16"/>
-              </w:rPr>
-              <w:t xml:space="preserve">Owned full lifecycle solo: discovery, PRD, LLM prompt design, API integration, UX, deployment, post-launch iteration.</w:t>
-            </w:r>
-          </w:p>
-          <w:p>
-            <w:pPr>
-              <w:spacing w:after="20" w:before="80"/>
-              <w:jc w:val="left"/>
-            </w:pPr>
-            <w:r>
-              <w:rPr>
-                <w:rFonts w:ascii="Arial" w:cs="Arial" w:eastAsia="Arial" w:hAnsi="Arial"/>
-                <w:b/>
-                <w:bCs/>
-                <w:i w:val="false"/>
-                <w:iCs w:val="false"/>
-                <w:color w:val="26303D"/>
-                <w:sz w:val="19"/>
-                <w:szCs w:val="19"/>
+              <w:spacing w:after="10" w:before="10" w:line="230"/>
+              <w:ind w:left="160" w:hanging="160"/>
+              <w:jc w:val="left"/>
+            </w:pPr>
+            <w:r>
+              <w:rPr>
+                <w:rFonts w:ascii="Arial" w:cs="Arial" w:eastAsia="Arial" w:hAnsi="Arial"/>
+                <w:b w:val="false"/>
+                <w:bCs w:val="false"/>
+                <w:i w:val="false"/>
+                <w:iCs w:val="false"/>
+                <w:color w:val="26303D"/>
+                <w:sz w:val="16"/>
+                <w:szCs w:val="16"/>
+              </w:rPr>
+              <w:t xml:space="preserve">• </w:t>
+            </w:r>
+            <w:r>
+              <w:rPr>
+                <w:rFonts w:ascii="Arial" w:cs="Arial" w:eastAsia="Arial" w:hAnsi="Arial"/>
+                <w:b w:val="false"/>
+                <w:bCs w:val="false"/>
+                <w:i w:val="false"/>
+                <w:iCs w:val="false"/>
+                <w:color w:val="26303D"/>
+                <w:sz w:val="16"/>
+                <w:szCs w:val="16"/>
+              </w:rPr>
+              <w:t xml:space="preserve">Owned full lifecycle solo: discovery, PRD, LLM prompt design, API integration, UX, deployment, iteration.</w:t>
+            </w:r>
+          </w:p>
+          <w:p>
+            <w:pPr>
+              <w:spacing w:after="0" w:before="40" w:line="240"/>
+              <w:jc w:val="left"/>
+            </w:pPr>
+            <w:r>
+              <w:rPr>
+                <w:rFonts w:ascii="Arial" w:cs="Arial" w:eastAsia="Arial" w:hAnsi="Arial"/>
+                <w:b/>
+                <w:bCs/>
+                <w:i w:val="false"/>
+                <w:iCs w:val="false"/>
+                <w:color w:val="26303D"/>
+                <w:sz w:val="18"/>
+                <w:szCs w:val="18"/>
               </w:rPr>
               <w:t xml:space="preserve">PlayPal</w:t>
             </w:r>
@@ -992,8 +999,8 @@
                 <w:b/>
                 <w:bCs/>
                 <w:color w:val="FFFFFF"/>
-                <w:sz w:val="14"/>
-                <w:szCs w:val="14"/>
+                <w:sz w:val="13"/>
+                <w:szCs w:val="13"/>
                 <w:shd w:fill="1B4FD8" w:color="1B4FD8" w:val="clear"/>
               </w:rPr>
               <w:t xml:space="preserve"> LIVE MVP </w:t>
@@ -1001,7 +1008,7 @@
           </w:p>
           <w:p>
             <w:pPr>
-              <w:spacing w:after="20" w:before="20"/>
+              <w:spacing w:after="0" w:before="0" w:line="240"/>
               <w:jc w:val="left"/>
             </w:pPr>
             <w:r>
@@ -1012,23 +1019,24 @@
                 <w:i/>
                 <w:iCs/>
                 <w:color w:val="55606E"/>
-                <w:sz w:val="15"/>
-                <w:szCs w:val="15"/>
+                <w:sz w:val="14"/>
+                <w:szCs w:val="14"/>
               </w:rPr>
               <w:t xml:space="preserve">React · Supabase · Lovable</w:t>
             </w:r>
           </w:p>
           <w:p>
             <w:pPr>
-              <w:spacing w:after="30" w:before="0"/>
-            </w:pPr>
-            <w:hyperlink w:history="1" r:id="rIduj59ia8-jiwlxrwbhur7a">
+              <w:spacing w:after="10" w:before="0" w:line="240"/>
+              <w:jc w:val="left"/>
+            </w:pPr>
+            <w:hyperlink w:history="1" r:id="rIdzjhbhsg392i4rqdqryshi">
               <w:r>
                 <w:rPr>
                   <w:rFonts w:ascii="Arial" w:cs="Arial" w:eastAsia="Arial" w:hAnsi="Arial"/>
                   <w:color w:val="1B4FD8"/>
-                  <w:sz w:val="16"/>
-                  <w:szCs w:val="16"/>
+                  <w:sz w:val="14"/>
+                  <w:szCs w:val="14"/>
                   <w:u w:val="single"/>
                 </w:rPr>
                 <w:t xml:space="preserve">sport-link-app.lovable.app</w:t>
@@ -1037,21 +1045,22 @@
           </w:p>
           <w:p>
             <w:pPr>
-              <w:spacing w:after="20" w:before="20"/>
-              <w:ind w:left="200" w:hanging="200"/>
-            </w:pPr>
-            <w:r>
-              <w:rPr>
-                <w:rFonts w:ascii="Arial" w:cs="Arial" w:eastAsia="Arial" w:hAnsi="Arial"/>
-                <w:b w:val="false"/>
-                <w:bCs w:val="false"/>
-                <w:i w:val="false"/>
-                <w:iCs w:val="false"/>
-                <w:color w:val="26303D"/>
-                <w:sz w:val="16"/>
-                <w:szCs w:val="16"/>
-              </w:rPr>
-              <w:t xml:space="preserve">•  </w:t>
+              <w:spacing w:after="10" w:before="10" w:line="230"/>
+              <w:ind w:left="160" w:hanging="160"/>
+              <w:jc w:val="left"/>
+            </w:pPr>
+            <w:r>
+              <w:rPr>
+                <w:rFonts w:ascii="Arial" w:cs="Arial" w:eastAsia="Arial" w:hAnsi="Arial"/>
+                <w:b w:val="false"/>
+                <w:bCs w:val="false"/>
+                <w:i w:val="false"/>
+                <w:iCs w:val="false"/>
+                <w:color w:val="26303D"/>
+                <w:sz w:val="16"/>
+                <w:szCs w:val="16"/>
+              </w:rPr>
+              <w:t xml:space="preserve">• </w:t>
             </w:r>
             <w:r>
               <w:rPr>
@@ -1072,43 +1081,45 @@
               <w:pBdr>
                 <w:bottom w:val="single" w:color="1B4FD8" w:sz="1"/>
               </w:pBdr>
-              <w:spacing w:after="80" w:before="200"/>
-            </w:pPr>
-            <w:r>
-              <w:rPr>
-                <w:rFonts w:ascii="Arial" w:cs="Arial" w:eastAsia="Arial" w:hAnsi="Arial"/>
-                <w:b/>
-                <w:bCs/>
-                <w:caps/>
+              <w:spacing w:after="40" w:before="120" w:line="240"/>
+              <w:jc w:val="left"/>
+            </w:pPr>
+            <w:r>
+              <w:rPr>
+                <w:rFonts w:ascii="Arial" w:cs="Arial" w:eastAsia="Arial" w:hAnsi="Arial"/>
+                <w:b/>
+                <w:bCs/>
+                <w:i w:val="false"/>
+                <w:iCs w:val="false"/>
                 <w:color w:val="1B4FD8"/>
-                <w:sz w:val="21"/>
-                <w:szCs w:val="21"/>
-              </w:rPr>
-              <w:t xml:space="preserve">EXPERIENCE</w:t>
-            </w:r>
-          </w:p>
-          <w:p>
-            <w:pPr>
-              <w:spacing w:after="20" w:before="60"/>
-              <w:jc w:val="left"/>
-            </w:pPr>
-            <w:r>
-              <w:rPr>
-                <w:rFonts w:ascii="Arial" w:cs="Arial" w:eastAsia="Arial" w:hAnsi="Arial"/>
-                <w:b/>
-                <w:bCs/>
-                <w:i w:val="false"/>
-                <w:iCs w:val="false"/>
-                <w:color w:val="26303D"/>
                 <w:sz w:val="19"/>
                 <w:szCs w:val="19"/>
               </w:rPr>
+              <w:t xml:space="preserve">EXPERIENCE</w:t>
+            </w:r>
+          </w:p>
+          <w:p>
+            <w:pPr>
+              <w:spacing w:after="0" w:before="30" w:line="240"/>
+              <w:jc w:val="left"/>
+            </w:pPr>
+            <w:r>
+              <w:rPr>
+                <w:rFonts w:ascii="Arial" w:cs="Arial" w:eastAsia="Arial" w:hAnsi="Arial"/>
+                <w:b/>
+                <w:bCs/>
+                <w:i w:val="false"/>
+                <w:iCs w:val="false"/>
+                <w:color w:val="26303D"/>
+                <w:sz w:val="18"/>
+                <w:szCs w:val="18"/>
+              </w:rPr>
               <w:t xml:space="preserve">Customer Success Manager</w:t>
             </w:r>
           </w:p>
           <w:p>
             <w:pPr>
-              <w:spacing w:after="15" w:before="20"/>
+              <w:spacing w:after="10" w:before="0" w:line="240"/>
               <w:jc w:val="left"/>
             </w:pPr>
             <w:r>
@@ -1119,29 +1130,30 @@
                 <w:i/>
                 <w:iCs/>
                 <w:color w:val="55606E"/>
-                <w:sz w:val="15"/>
-                <w:szCs w:val="15"/>
+                <w:sz w:val="14"/>
+                <w:szCs w:val="14"/>
               </w:rPr>
               <w:t xml:space="preserve">Octopus Era, Paris · 2023 – 2024</w:t>
             </w:r>
           </w:p>
           <w:p>
             <w:pPr>
-              <w:spacing w:after="20" w:before="20"/>
-              <w:ind w:left="200" w:hanging="200"/>
-            </w:pPr>
-            <w:r>
-              <w:rPr>
-                <w:rFonts w:ascii="Arial" w:cs="Arial" w:eastAsia="Arial" w:hAnsi="Arial"/>
-                <w:b w:val="false"/>
-                <w:bCs w:val="false"/>
-                <w:i w:val="false"/>
-                <w:iCs w:val="false"/>
-                <w:color w:val="26303D"/>
-                <w:sz w:val="16"/>
-                <w:szCs w:val="16"/>
-              </w:rPr>
-              <w:t xml:space="preserve">•  </w:t>
+              <w:spacing w:after="10" w:before="10" w:line="230"/>
+              <w:ind w:left="160" w:hanging="160"/>
+              <w:jc w:val="left"/>
+            </w:pPr>
+            <w:r>
+              <w:rPr>
+                <w:rFonts w:ascii="Arial" w:cs="Arial" w:eastAsia="Arial" w:hAnsi="Arial"/>
+                <w:b w:val="false"/>
+                <w:bCs w:val="false"/>
+                <w:i w:val="false"/>
+                <w:iCs w:val="false"/>
+                <w:color w:val="26303D"/>
+                <w:sz w:val="16"/>
+                <w:szCs w:val="16"/>
+              </w:rPr>
+              <w:t xml:space="preserve">• </w:t>
             </w:r>
             <w:r>
               <w:rPr>
@@ -1159,21 +1171,22 @@
           </w:p>
           <w:p>
             <w:pPr>
-              <w:spacing w:after="20" w:before="20"/>
-              <w:ind w:left="200" w:hanging="200"/>
-            </w:pPr>
-            <w:r>
-              <w:rPr>
-                <w:rFonts w:ascii="Arial" w:cs="Arial" w:eastAsia="Arial" w:hAnsi="Arial"/>
-                <w:b w:val="false"/>
-                <w:bCs w:val="false"/>
-                <w:i w:val="false"/>
-                <w:iCs w:val="false"/>
-                <w:color w:val="26303D"/>
-                <w:sz w:val="16"/>
-                <w:szCs w:val="16"/>
-              </w:rPr>
-              <w:t xml:space="preserve">•  </w:t>
+              <w:spacing w:after="10" w:before="10" w:line="230"/>
+              <w:ind w:left="160" w:hanging="160"/>
+              <w:jc w:val="left"/>
+            </w:pPr>
+            <w:r>
+              <w:rPr>
+                <w:rFonts w:ascii="Arial" w:cs="Arial" w:eastAsia="Arial" w:hAnsi="Arial"/>
+                <w:b w:val="false"/>
+                <w:bCs w:val="false"/>
+                <w:i w:val="false"/>
+                <w:iCs w:val="false"/>
+                <w:color w:val="26303D"/>
+                <w:sz w:val="16"/>
+                <w:szCs w:val="16"/>
+              </w:rPr>
+              <w:t xml:space="preserve">• </w:t>
             </w:r>
             <w:r>
               <w:rPr>
@@ -1191,26 +1204,26 @@
           </w:p>
           <w:p>
             <w:pPr>
-              <w:spacing w:after="20" w:before="80"/>
-              <w:jc w:val="left"/>
-            </w:pPr>
-            <w:r>
-              <w:rPr>
-                <w:rFonts w:ascii="Arial" w:cs="Arial" w:eastAsia="Arial" w:hAnsi="Arial"/>
-                <w:b/>
-                <w:bCs/>
-                <w:i w:val="false"/>
-                <w:iCs w:val="false"/>
-                <w:color w:val="26303D"/>
-                <w:sz w:val="19"/>
-                <w:szCs w:val="19"/>
+              <w:spacing w:after="0" w:before="40" w:line="240"/>
+              <w:jc w:val="left"/>
+            </w:pPr>
+            <w:r>
+              <w:rPr>
+                <w:rFonts w:ascii="Arial" w:cs="Arial" w:eastAsia="Arial" w:hAnsi="Arial"/>
+                <w:b/>
+                <w:bCs/>
+                <w:i w:val="false"/>
+                <w:iCs w:val="false"/>
+                <w:color w:val="26303D"/>
+                <w:sz w:val="18"/>
+                <w:szCs w:val="18"/>
               </w:rPr>
               <w:t xml:space="preserve">Product Support Engineer</w:t>
             </w:r>
           </w:p>
           <w:p>
             <w:pPr>
-              <w:spacing w:after="15" w:before="20"/>
+              <w:spacing w:after="10" w:before="0" w:line="240"/>
               <w:jc w:val="left"/>
             </w:pPr>
             <w:r>
@@ -1221,29 +1234,30 @@
                 <w:i/>
                 <w:iCs/>
                 <w:color w:val="55606E"/>
-                <w:sz w:val="15"/>
-                <w:szCs w:val="15"/>
+                <w:sz w:val="14"/>
+                <w:szCs w:val="14"/>
               </w:rPr>
               <w:t xml:space="preserve">Vxceed Software, Bengaluru · 2021 – 2022</w:t>
             </w:r>
           </w:p>
           <w:p>
             <w:pPr>
-              <w:spacing w:after="20" w:before="20"/>
-              <w:ind w:left="200" w:hanging="200"/>
-            </w:pPr>
-            <w:r>
-              <w:rPr>
-                <w:rFonts w:ascii="Arial" w:cs="Arial" w:eastAsia="Arial" w:hAnsi="Arial"/>
-                <w:b w:val="false"/>
-                <w:bCs w:val="false"/>
-                <w:i w:val="false"/>
-                <w:iCs w:val="false"/>
-                <w:color w:val="26303D"/>
-                <w:sz w:val="16"/>
-                <w:szCs w:val="16"/>
-              </w:rPr>
-              <w:t xml:space="preserve">•  </w:t>
+              <w:spacing w:after="10" w:before="10" w:line="230"/>
+              <w:ind w:left="160" w:hanging="160"/>
+              <w:jc w:val="left"/>
+            </w:pPr>
+            <w:r>
+              <w:rPr>
+                <w:rFonts w:ascii="Arial" w:cs="Arial" w:eastAsia="Arial" w:hAnsi="Arial"/>
+                <w:b w:val="false"/>
+                <w:bCs w:val="false"/>
+                <w:i w:val="false"/>
+                <w:iCs w:val="false"/>
+                <w:color w:val="26303D"/>
+                <w:sz w:val="16"/>
+                <w:szCs w:val="16"/>
+              </w:rPr>
+              <w:t xml:space="preserve">• </w:t>
             </w:r>
             <w:r>
               <w:rPr>
@@ -1261,21 +1275,22 @@
           </w:p>
           <w:p>
             <w:pPr>
-              <w:spacing w:after="20" w:before="20"/>
-              <w:ind w:left="200" w:hanging="200"/>
-            </w:pPr>
-            <w:r>
-              <w:rPr>
-                <w:rFonts w:ascii="Arial" w:cs="Arial" w:eastAsia="Arial" w:hAnsi="Arial"/>
-                <w:b w:val="false"/>
-                <w:bCs w:val="false"/>
-                <w:i w:val="false"/>
-                <w:iCs w:val="false"/>
-                <w:color w:val="26303D"/>
-                <w:sz w:val="16"/>
-                <w:szCs w:val="16"/>
-              </w:rPr>
-              <w:t xml:space="preserve">•  </w:t>
+              <w:spacing w:after="10" w:before="10" w:line="230"/>
+              <w:ind w:left="160" w:hanging="160"/>
+              <w:jc w:val="left"/>
+            </w:pPr>
+            <w:r>
+              <w:rPr>
+                <w:rFonts w:ascii="Arial" w:cs="Arial" w:eastAsia="Arial" w:hAnsi="Arial"/>
+                <w:b w:val="false"/>
+                <w:bCs w:val="false"/>
+                <w:i w:val="false"/>
+                <w:iCs w:val="false"/>
+                <w:color w:val="26303D"/>
+                <w:sz w:val="16"/>
+                <w:szCs w:val="16"/>
+              </w:rPr>
+              <w:t xml:space="preserve">• </w:t>
             </w:r>
             <w:r>
               <w:rPr>
@@ -1293,26 +1308,26 @@
           </w:p>
           <w:p>
             <w:pPr>
-              <w:spacing w:after="20" w:before="80"/>
-              <w:jc w:val="left"/>
-            </w:pPr>
-            <w:r>
-              <w:rPr>
-                <w:rFonts w:ascii="Arial" w:cs="Arial" w:eastAsia="Arial" w:hAnsi="Arial"/>
-                <w:b/>
-                <w:bCs/>
-                <w:i w:val="false"/>
-                <w:iCs w:val="false"/>
-                <w:color w:val="26303D"/>
-                <w:sz w:val="19"/>
-                <w:szCs w:val="19"/>
+              <w:spacing w:after="0" w:before="40" w:line="240"/>
+              <w:jc w:val="left"/>
+            </w:pPr>
+            <w:r>
+              <w:rPr>
+                <w:rFonts w:ascii="Arial" w:cs="Arial" w:eastAsia="Arial" w:hAnsi="Arial"/>
+                <w:b/>
+                <w:bCs/>
+                <w:i w:val="false"/>
+                <w:iCs w:val="false"/>
+                <w:color w:val="26303D"/>
+                <w:sz w:val="18"/>
+                <w:szCs w:val="18"/>
               </w:rPr>
               <w:t xml:space="preserve">Sales &amp; Marketing Intern</w:t>
             </w:r>
           </w:p>
           <w:p>
             <w:pPr>
-              <w:spacing w:after="15" w:before="20"/>
+              <w:spacing w:after="10" w:before="0" w:line="240"/>
               <w:jc w:val="left"/>
             </w:pPr>
             <w:r>
@@ -1323,29 +1338,30 @@
                 <w:i/>
                 <w:iCs/>
                 <w:color w:val="55606E"/>
-                <w:sz w:val="15"/>
-                <w:szCs w:val="15"/>
+                <w:sz w:val="14"/>
+                <w:szCs w:val="14"/>
               </w:rPr>
               <w:t xml:space="preserve">iCell, Paris · 2025 – 2026 (part-time)</w:t>
             </w:r>
           </w:p>
           <w:p>
             <w:pPr>
-              <w:spacing w:after="20" w:before="20"/>
-              <w:ind w:left="200" w:hanging="200"/>
-            </w:pPr>
-            <w:r>
-              <w:rPr>
-                <w:rFonts w:ascii="Arial" w:cs="Arial" w:eastAsia="Arial" w:hAnsi="Arial"/>
-                <w:b w:val="false"/>
-                <w:bCs w:val="false"/>
-                <w:i w:val="false"/>
-                <w:iCs w:val="false"/>
-                <w:color w:val="26303D"/>
-                <w:sz w:val="16"/>
-                <w:szCs w:val="16"/>
-              </w:rPr>
-              <w:t xml:space="preserve">•  </w:t>
+              <w:spacing w:after="10" w:before="10" w:line="230"/>
+              <w:ind w:left="160" w:hanging="160"/>
+              <w:jc w:val="left"/>
+            </w:pPr>
+            <w:r>
+              <w:rPr>
+                <w:rFonts w:ascii="Arial" w:cs="Arial" w:eastAsia="Arial" w:hAnsi="Arial"/>
+                <w:b w:val="false"/>
+                <w:bCs w:val="false"/>
+                <w:i w:val="false"/>
+                <w:iCs w:val="false"/>
+                <w:color w:val="26303D"/>
+                <w:sz w:val="16"/>
+                <w:szCs w:val="16"/>
+              </w:rPr>
+              <w:t xml:space="preserve">• </w:t>
             </w:r>
             <w:r>
               <w:rPr>
@@ -1366,36 +1382,38 @@
               <w:pBdr>
                 <w:bottom w:val="single" w:color="1B4FD8" w:sz="1"/>
               </w:pBdr>
-              <w:spacing w:after="80" w:before="200"/>
-            </w:pPr>
-            <w:r>
-              <w:rPr>
-                <w:rFonts w:ascii="Arial" w:cs="Arial" w:eastAsia="Arial" w:hAnsi="Arial"/>
-                <w:b/>
-                <w:bCs/>
-                <w:caps/>
+              <w:spacing w:after="40" w:before="120" w:line="240"/>
+              <w:jc w:val="left"/>
+            </w:pPr>
+            <w:r>
+              <w:rPr>
+                <w:rFonts w:ascii="Arial" w:cs="Arial" w:eastAsia="Arial" w:hAnsi="Arial"/>
+                <w:b/>
+                <w:bCs/>
+                <w:i w:val="false"/>
+                <w:iCs w:val="false"/>
                 <w:color w:val="1B4FD8"/>
-                <w:sz w:val="21"/>
-                <w:szCs w:val="21"/>
+                <w:sz w:val="19"/>
+                <w:szCs w:val="19"/>
               </w:rPr>
               <w:t xml:space="preserve">PRODUCT CASE STUDIES</w:t>
             </w:r>
           </w:p>
           <w:p>
             <w:pPr>
-              <w:spacing w:after="15" w:before="40"/>
-              <w:jc w:val="left"/>
-            </w:pPr>
-            <w:r>
-              <w:rPr>
-                <w:rFonts w:ascii="Arial" w:cs="Arial" w:eastAsia="Arial" w:hAnsi="Arial"/>
-                <w:b/>
-                <w:bCs/>
-                <w:i w:val="false"/>
-                <w:iCs w:val="false"/>
-                <w:color w:val="26303D"/>
-                <w:sz w:val="17"/>
-                <w:szCs w:val="17"/>
+              <w:spacing w:after="10" w:before="20" w:line="230"/>
+              <w:jc w:val="left"/>
+            </w:pPr>
+            <w:r>
+              <w:rPr>
+                <w:rFonts w:ascii="Arial" w:cs="Arial" w:eastAsia="Arial" w:hAnsi="Arial"/>
+                <w:b/>
+                <w:bCs/>
+                <w:i w:val="false"/>
+                <w:iCs w:val="false"/>
+                <w:color w:val="26303D"/>
+                <w:sz w:val="16"/>
+                <w:szCs w:val="16"/>
               </w:rPr>
               <w:t xml:space="preserve">PhotoRoom </w:t>
             </w:r>
@@ -1407,100 +1425,101 @@
                 <w:i w:val="false"/>
                 <w:iCs w:val="false"/>
                 <w:color w:val="26303D"/>
-                <w:sz w:val="16"/>
-                <w:szCs w:val="16"/>
-              </w:rPr>
-              <w:t xml:space="preserve">(pricing): diagnosed flat-rate subs vs. rising AI compute costs; designed 3-layer monetisation fix.</w:t>
-            </w:r>
-          </w:p>
-          <w:p>
-            <w:pPr>
-              <w:spacing w:after="15" w:before="15"/>
-              <w:jc w:val="left"/>
-            </w:pPr>
-            <w:r>
-              <w:rPr>
-                <w:rFonts w:ascii="Arial" w:cs="Arial" w:eastAsia="Arial" w:hAnsi="Arial"/>
-                <w:b/>
-                <w:bCs/>
-                <w:i w:val="false"/>
-                <w:iCs w:val="false"/>
-                <w:color w:val="26303D"/>
-                <w:sz w:val="17"/>
-                <w:szCs w:val="17"/>
-              </w:rPr>
-              <w:t xml:space="preserve">Joko </w:t>
-            </w:r>
-            <w:r>
-              <w:rPr>
-                <w:rFonts w:ascii="Arial" w:cs="Arial" w:eastAsia="Arial" w:hAnsi="Arial"/>
-                <w:b w:val="false"/>
-                <w:bCs w:val="false"/>
-                <w:i w:val="false"/>
-                <w:iCs w:val="false"/>
-                <w:color w:val="26303D"/>
-                <w:sz w:val="16"/>
-                <w:szCs w:val="16"/>
-              </w:rPr>
-              <w:t xml:space="preserve">(retention): redesigned milestone loop to break 30-day churn, drive daily engagement (4M+ users).</w:t>
-            </w:r>
-          </w:p>
-          <w:p>
-            <w:pPr>
-              <w:spacing w:after="15" w:before="15"/>
-              <w:jc w:val="left"/>
-            </w:pPr>
-            <w:r>
-              <w:rPr>
-                <w:rFonts w:ascii="Arial" w:cs="Arial" w:eastAsia="Arial" w:hAnsi="Arial"/>
-                <w:b/>
-                <w:bCs/>
-                <w:i w:val="false"/>
-                <w:iCs w:val="false"/>
-                <w:color w:val="26303D"/>
-                <w:sz w:val="17"/>
-                <w:szCs w:val="17"/>
-              </w:rPr>
-              <w:t xml:space="preserve">Netflix </w:t>
-            </w:r>
-            <w:r>
-              <w:rPr>
-                <w:rFonts w:ascii="Arial" w:cs="Arial" w:eastAsia="Arial" w:hAnsi="Arial"/>
-                <w:b w:val="false"/>
-                <w:bCs w:val="false"/>
-                <w:i w:val="false"/>
-                <w:iCs w:val="false"/>
-                <w:color w:val="26303D"/>
-                <w:sz w:val="16"/>
-                <w:szCs w:val="16"/>
-              </w:rPr>
-              <w:t xml:space="preserve">(Gen Z growth): designed short-form clips feed converting scroll attention to full-title viewing (270M+ subs).</w:t>
-            </w:r>
-          </w:p>
-          <w:p>
-            <w:pPr>
-              <w:spacing w:after="30" w:before="15"/>
-            </w:pPr>
-            <w:r>
-              <w:rPr>
-                <w:rFonts w:ascii="Arial" w:cs="Arial" w:eastAsia="Arial" w:hAnsi="Arial"/>
-                <w:b w:val="false"/>
-                <w:bCs w:val="false"/>
-                <w:i w:val="false"/>
-                <w:iCs w:val="false"/>
-                <w:color w:val="55606E"/>
                 <w:sz w:val="15"/>
                 <w:szCs w:val="15"/>
               </w:rPr>
+              <w:t xml:space="preserve">(pricing): diagnosed flat-rate subs vs. rising AI compute costs; designed 3-layer monetisation fix.</w:t>
+            </w:r>
+          </w:p>
+          <w:p>
+            <w:pPr>
+              <w:spacing w:after="10" w:before="10" w:line="230"/>
+              <w:jc w:val="left"/>
+            </w:pPr>
+            <w:r>
+              <w:rPr>
+                <w:rFonts w:ascii="Arial" w:cs="Arial" w:eastAsia="Arial" w:hAnsi="Arial"/>
+                <w:b/>
+                <w:bCs/>
+                <w:i w:val="false"/>
+                <w:iCs w:val="false"/>
+                <w:color w:val="26303D"/>
+                <w:sz w:val="16"/>
+                <w:szCs w:val="16"/>
+              </w:rPr>
+              <w:t xml:space="preserve">Joko </w:t>
+            </w:r>
+            <w:r>
+              <w:rPr>
+                <w:rFonts w:ascii="Arial" w:cs="Arial" w:eastAsia="Arial" w:hAnsi="Arial"/>
+                <w:b w:val="false"/>
+                <w:bCs w:val="false"/>
+                <w:i w:val="false"/>
+                <w:iCs w:val="false"/>
+                <w:color w:val="26303D"/>
+                <w:sz w:val="15"/>
+                <w:szCs w:val="15"/>
+              </w:rPr>
+              <w:t xml:space="preserve">(retention): redesigned milestone loop to break 30-day churn, drive daily engagement (4M+ users).</w:t>
+            </w:r>
+          </w:p>
+          <w:p>
+            <w:pPr>
+              <w:spacing w:after="10" w:before="10" w:line="230"/>
+              <w:jc w:val="left"/>
+            </w:pPr>
+            <w:r>
+              <w:rPr>
+                <w:rFonts w:ascii="Arial" w:cs="Arial" w:eastAsia="Arial" w:hAnsi="Arial"/>
+                <w:b/>
+                <w:bCs/>
+                <w:i w:val="false"/>
+                <w:iCs w:val="false"/>
+                <w:color w:val="26303D"/>
+                <w:sz w:val="16"/>
+                <w:szCs w:val="16"/>
+              </w:rPr>
+              <w:t xml:space="preserve">Netflix </w:t>
+            </w:r>
+            <w:r>
+              <w:rPr>
+                <w:rFonts w:ascii="Arial" w:cs="Arial" w:eastAsia="Arial" w:hAnsi="Arial"/>
+                <w:b w:val="false"/>
+                <w:bCs w:val="false"/>
+                <w:i w:val="false"/>
+                <w:iCs w:val="false"/>
+                <w:color w:val="26303D"/>
+                <w:sz w:val="15"/>
+                <w:szCs w:val="15"/>
+              </w:rPr>
+              <w:t xml:space="preserve">(Gen Z growth): designed short-form clips feed converting scroll attention to full-title viewing (270M+ subs).</w:t>
+            </w:r>
+          </w:p>
+          <w:p>
+            <w:pPr>
+              <w:spacing w:after="10" w:before="10" w:line="240"/>
+              <w:jc w:val="left"/>
+            </w:pPr>
+            <w:r>
+              <w:rPr>
+                <w:rFonts w:ascii="Arial" w:cs="Arial" w:eastAsia="Arial" w:hAnsi="Arial"/>
+                <w:b w:val="false"/>
+                <w:bCs w:val="false"/>
+                <w:i w:val="false"/>
+                <w:iCs w:val="false"/>
+                <w:color w:val="55606E"/>
+                <w:sz w:val="14"/>
+                <w:szCs w:val="14"/>
+              </w:rPr>
               <w:t xml:space="preserve">All case studies: </w:t>
             </w:r>
-            <w:hyperlink w:history="1" r:id="rIdzdhteyrcsnvfcuotzaulz">
+            <w:hyperlink w:history="1" r:id="rId0hd1zlsohla663qmqmfjv">
               <w:r>
                 <w:rPr>
                   <w:rFonts w:ascii="Arial" w:cs="Arial" w:eastAsia="Arial" w:hAnsi="Arial"/>
                   <w:color w:val="1B4FD8"/>
-                  <w:sz w:val="16"/>
-                  <w:szCs w:val="16"/>
+                  <w:sz w:val="14"/>
+                  <w:szCs w:val="14"/>
                   <w:u w:val="single"/>
                 </w:rPr>
                 <w:t xml:space="preserve">portfolio-orcin-nu-xm2481apwv.vercel.app</w:t>
@@ -1515,24 +1534,27 @@
         <w:pBdr>
           <w:bottom w:val="single" w:color="1B4FD8" w:sz="1"/>
         </w:pBdr>
-        <w:spacing w:after="70" w:before="160"/>
+        <w:spacing w:after="40" w:before="100" w:line="240"/>
+        <w:jc w:val="left"/>
       </w:pPr>
       <w:r>
         <w:rPr>
           <w:rFonts w:ascii="Arial" w:cs="Arial" w:eastAsia="Arial" w:hAnsi="Arial"/>
           <w:b/>
           <w:bCs/>
-          <w:caps/>
+          <w:i w:val="false"/>
+          <w:iCs w:val="false"/>
           <w:color w:val="1B4FD8"/>
-          <w:sz w:val="19"/>
-          <w:szCs w:val="19"/>
+          <w:sz w:val="18"/>
+          <w:szCs w:val="18"/>
         </w:rPr>
         <w:t xml:space="preserve">KEY SKILLS &amp; KEYWORDS</w:t>
       </w:r>
     </w:p>
     <w:p>
       <w:pPr>
-        <w:spacing w:after="20" w:before="20"/>
+        <w:spacing w:after="8" w:before="8" w:line="220"/>
+        <w:jc w:val="left"/>
       </w:pPr>
       <w:r>
         <w:rPr>
@@ -1558,12 +1580,13 @@
           <w:sz w:val="14"/>
           <w:szCs w:val="14"/>
         </w:rPr>
-        <w:t xml:space="preserve">PRD writing · product discovery · user research &amp; JTBD · user story mapping · roadmapping · OKRs · RICE · MVP scoping · SDLC · backlog mgmt</w:t>
+        <w:t xml:space="preserve">PRD writing · product discovery · user research &amp; JTBD · story mapping · roadmapping · OKRs · RICE · MVP scoping · SDLC · backlog mgmt</w:t>
       </w:r>
     </w:p>
     <w:p>
       <w:pPr>
-        <w:spacing w:after="20" w:before="20"/>
+        <w:spacing w:after="8" w:before="8" w:line="220"/>
+        <w:jc w:val="left"/>
       </w:pPr>
       <w:r>
         <w:rPr>
@@ -1594,7 +1617,8 @@
     </w:p>
     <w:p>
       <w:pPr>
-        <w:spacing w:after="20" w:before="20"/>
+        <w:spacing w:after="8" w:before="8" w:line="220"/>
+        <w:jc w:val="left"/>
       </w:pPr>
       <w:r>
         <w:rPr>
@@ -1625,7 +1649,8 @@
     </w:p>
     <w:p>
       <w:pPr>
-        <w:spacing w:after="20" w:before="20"/>
+        <w:spacing w:after="8" w:before="8" w:line="220"/>
+        <w:jc w:val="left"/>
       </w:pPr>
       <w:r>
         <w:rPr>

</xml_diff>